<commit_message>
Practica Calificada 001 completa
</commit_message>
<xml_diff>
--- a/PRACTICA  01.docx
+++ b/PRACTICA  01.docx
@@ -129,25 +129,7 @@
           <w:b/>
           <w:bCs/>
         </w:rPr>
-        <w:t xml:space="preserve">LABORATORIO </w:t>
-      </w:r>
-      <w:proofErr w:type="spellStart"/>
-      <w:r>
-        <w:rPr>
-          <w:rFonts w:ascii="Times New Roman" w:hAnsi="Times New Roman" w:cs="Times New Roman"/>
-          <w:b/>
-          <w:bCs/>
-        </w:rPr>
-        <w:t>N°</w:t>
-      </w:r>
-      <w:proofErr w:type="spellEnd"/>
-      <w:r>
-        <w:rPr>
-          <w:rFonts w:ascii="Times New Roman" w:hAnsi="Times New Roman" w:cs="Times New Roman"/>
-          <w:b/>
-          <w:bCs/>
-        </w:rPr>
-        <w:t xml:space="preserve"> 01</w:t>
+        <w:t>LABORATORIO N° 01</w:t>
       </w:r>
     </w:p>
     <w:p>
@@ -352,12 +334,28 @@
       </w:r>
     </w:p>
     <w:p/>
-    <w:p>
+    <w:p/>
+    <w:p>
+      <w:pPr>
+        <w:rPr>
+          <w:sz w:val="36"/>
+          <w:szCs w:val="36"/>
+        </w:rPr>
+      </w:pPr>
+      <w:r>
+        <w:rPr>
+          <w:sz w:val="36"/>
+          <w:szCs w:val="36"/>
+        </w:rPr>
+        <w:lastRenderedPageBreak/>
+        <w:t>PARTE 1 - INFORME (A MANO)</w:t>
+      </w:r>
       <w:r>
         <w:rPr>
           <w:noProof/>
-        </w:rPr>
-        <w:lastRenderedPageBreak/>
+          <w:sz w:val="36"/>
+          <w:szCs w:val="36"/>
+        </w:rPr>
         <w:drawing>
           <wp:inline distT="0" distB="0" distL="0" distR="0" wp14:anchorId="1CA0043D" wp14:editId="203AE517">
             <wp:extent cx="6066740" cy="7531100"/>
@@ -413,6 +411,8 @@
       <w:r>
         <w:rPr>
           <w:noProof/>
+          <w:sz w:val="36"/>
+          <w:szCs w:val="36"/>
         </w:rPr>
         <w:lastRenderedPageBreak/>
         <w:drawing>
@@ -466,6 +466,38 @@
             </a:graphic>
           </wp:inline>
         </w:drawing>
+      </w:r>
+    </w:p>
+    <w:p>
+      <w:pPr>
+        <w:rPr>
+          <w:b/>
+          <w:bCs/>
+          <w:sz w:val="36"/>
+          <w:szCs w:val="36"/>
+        </w:rPr>
+      </w:pPr>
+      <w:r>
+        <w:rPr>
+          <w:b/>
+          <w:bCs/>
+          <w:sz w:val="36"/>
+          <w:szCs w:val="36"/>
+        </w:rPr>
+        <w:t>PARTE 2 - CODIGO (REPOSITORIO DE GITHUB)</w:t>
+      </w:r>
+    </w:p>
+    <w:p>
+      <w:hyperlink r:id="rId7" w:history="1">
+        <w:r>
+          <w:rPr>
+            <w:rStyle w:val="Hipervnculo"/>
+          </w:rPr>
+          <w:t>https://github.com/zagazaga158-cell/IS484-Practica001-JUEVES-ZAGA/tree/68a4221be70a8c15bc2d496ccc1e3ac015c17eba</w:t>
+        </w:r>
+      </w:hyperlink>
+      <w:r>
+        <w:t xml:space="preserve"> </w:t>
       </w:r>
     </w:p>
     <w:sectPr>
@@ -1395,6 +1427,29 @@
       <w:spacing w:val="5"/>
     </w:rPr>
   </w:style>
+  <w:style w:type="character" w:styleId="Hipervnculo">
+    <w:name w:val="Hyperlink"/>
+    <w:basedOn w:val="Fuentedeprrafopredeter"/>
+    <w:uiPriority w:val="99"/>
+    <w:unhideWhenUsed/>
+    <w:rsid w:val="00EA3531"/>
+    <w:rPr>
+      <w:color w:val="467886" w:themeColor="hyperlink"/>
+      <w:u w:val="single"/>
+    </w:rPr>
+  </w:style>
+  <w:style w:type="character" w:styleId="Mencinsinresolver">
+    <w:name w:val="Unresolved Mention"/>
+    <w:basedOn w:val="Fuentedeprrafopredeter"/>
+    <w:uiPriority w:val="99"/>
+    <w:semiHidden/>
+    <w:unhideWhenUsed/>
+    <w:rsid w:val="00EA3531"/>
+    <w:rPr>
+      <w:color w:val="605E5C"/>
+      <w:shd w:val="clear" w:color="auto" w:fill="E1DFDD"/>
+    </w:rPr>
+  </w:style>
 </w:styles>
 </file>
 

</xml_diff>